<commit_message>
Build cinematic engineering portfolio
</commit_message>
<xml_diff>
--- a/cv_Shazin_July2026.docx
+++ b/cv_Shazin_July2026.docx
@@ -14,7 +14,7 @@
           <w:color w:val="173B57"/>
           <w:sz w:val="47"/>
         </w:rPr>
-        <w:t>AHMED SHAZIN</w:t>
+        <w:t>SHAZIN</w:t>
       </w:r>
     </w:p>
     <w:p>
@@ -889,6 +889,7 @@
     </w:p>
     <w:sectPr>
       <w:footerReference w:type="default" r:id="rId18"/>
+      <w:headerReference w:type="default" r:id="rId21"/>
       <w:pgSz w:w="11906" w:h="16838"/>
       <w:pgMar w:top="893" w:right="979" w:bottom="893" w:left="979" w:header="360" w:footer="403" w:gutter="0"/>
       <w:cols w:space="720"/>
@@ -935,7 +936,7 @@
         <w:color w:val="5B6570"/>
         <w:sz w:val="16"/>
       </w:rPr>
-      <w:t>Ahmed Shazin | Curriculum Vitae</w:t>
+      <w:t>Shazin | Curriculum Vitae</w:t>
     </w:r>
   </w:p>
 </w:ftr>
@@ -964,6 +965,16 @@
     </w:p>
   </w:footnote>
 </w:footnotes>
+</file>
+
+<file path=word/header1.xml><?xml version="1.0" encoding="utf-8"?>
+<w:hdr xmlns:m="http://schemas.openxmlformats.org/officeDocument/2006/math" xmlns:mc="http://schemas.openxmlformats.org/markup-compatibility/2006" xmlns:mo="http://schemas.microsoft.com/office/mac/office/2008/main" xmlns:mv="urn:schemas-microsoft-com:mac:vml" xmlns:o="urn:schemas-microsoft-com:office:office" xmlns:r="http://schemas.openxmlformats.org/officeDocument/2006/relationships" xmlns:v="urn:schemas-microsoft-com:vml" xmlns:w10="urn:schemas-microsoft-com:office:word" xmlns:w14="http://schemas.microsoft.com/office/word/2010/wordml" xmlns:w="http://schemas.openxmlformats.org/wordprocessingml/2006/main" xmlns:wne="http://schemas.microsoft.com/office/word/2006/wordml" xmlns:wp14="http://schemas.microsoft.com/office/word/2010/wordprocessingDrawing" xmlns:wp="http://schemas.openxmlformats.org/drawingml/2006/wordprocessingDrawing" xmlns:wpc="http://schemas.microsoft.com/office/word/2010/wordprocessingCanvas" xmlns:wpg="http://schemas.microsoft.com/office/word/2010/wordprocessingGroup" xmlns:wpi="http://schemas.microsoft.com/office/word/2010/wordprocessingInk" xmlns:wps="http://schemas.microsoft.com/office/word/2010/wordprocessingShape" mc:Ignorable="w14 wp14">
+  <w:p>
+    <w:pPr>
+      <w:pStyle w:val="Header"/>
+    </w:pPr>
+  </w:p>
+</w:hdr>
 </file>
 
 <file path=word/numbering.xml><?xml version="1.0" encoding="utf-8"?>

</xml_diff>

<commit_message>
Refine portfolio copy and expand motion with visibility-aware rendering
</commit_message>
<xml_diff>
--- a/cv_Shazin_July2026.docx
+++ b/cv_Shazin_July2026.docx
@@ -121,7 +121,7 @@
         <w:rPr>
           <w:sz w:val="19"/>
         </w:rPr>
-        <w:t>Final-year Computer Engineering student with a 3.63/4.00 CGPA and two Vice-Chancellor's List awards. Builds across embedded firmware, autonomous systems, discrete-event simulation and full-stack software, with a record of independent learning and open-source collaboration. Research interests include low-power sensor systems, heterogeneous robot coordination, simulation-based optimisation and practical Linux systems.</w:t>
+        <w:t>Final-year Computer Engineering student with a 3.63/4.00 CGPA and two Vice-Chancellor's List awards. My work includes firmware for satellite-connected sensors, a robot-fleet simulator, and contributions to OrcaSlicer. I'm interested in low-power sensors, robot coordination, and simulation-based optimisation. I also work on Linux projects outside my degree.</w:t>
       </w:r>
     </w:p>
     <w:p>
@@ -287,7 +287,7 @@
         </w:numPr>
       </w:pPr>
       <w:r>
-        <w:t>Engineered low-power and fault-tolerant behaviour including RTC shutdown/deep sleep, battery monitoring, automatic sensor detection, FRAM/EEPROM fallback storage and queued retransmission after connectivity failures.</w:t>
+        <w:t>Implemented RTC-controlled shutdown and deep sleep to reduce power use. Added battery monitoring, automatic sensor detection, and FRAM/EEPROM storage to queue unsent readings for the next connection.</w:t>
       </w:r>
     </w:p>
     <w:p>
@@ -300,7 +300,7 @@
         </w:numPr>
       </w:pPr>
       <w:r>
-        <w:t>Validated ground nodes in field deployments; documented handover material and guided incoming interns. Also standardised FDM printer calibration and OrcaSlicer profiles and prototyped node enclosures.</w:t>
+        <w:t>Tested ground nodes in field deployments, wrote handover documentation, and guided incoming interns. Also standardised FDM printer calibration and OrcaSlicer profiles and prototyped node enclosures.</w:t>
       </w:r>
     </w:p>
     <w:p>
@@ -359,7 +359,7 @@
         </w:numPr>
       </w:pPr>
       <w:r>
-        <w:t>Developing a simulation to determine efficient fleet composition and charging-station capacity for Langur harvesters, Howler collectors and Mandril transporters operating as a dependency-linked pipeline.</w:t>
+        <w:t>Developing a simulation to compare fleet sizes and charging capacity for oil-palm harvesting. The model accounts for how Langur harvesters, Howler collectors, and Mandril transporters depend on one another.</w:t>
       </w:r>
     </w:p>
     <w:p>
@@ -372,7 +372,7 @@
         </w:numPr>
       </w:pPr>
       <w:r>
-        <w:t>Implemented a SimPy core with geospatial plantation ingestion, Delaunay cell generation, battery/charging constraints, drainage-aware routing and Hungarian-assignment task allocation compared with greedy and field-sequential baselines.</w:t>
+        <w:t>Built a SimPy model using plantation data and Delaunay cells, with battery limits, charging, and drainage-aware routing. Compared Hungarian task assignment with greedy and field-sequential methods.</w:t>
       </w:r>
     </w:p>
     <w:p>
@@ -385,7 +385,7 @@
         </w:numPr>
       </w:pPr>
       <w:r>
-        <w:t>Built a FastAPI/SQLite backend and React/TypeScript dashboard with live WebSocket state, KPI analysis and repeatable parameter sweeps for robot ratios, fleet size and charging-station count.</w:t>
+        <w:t>Built a FastAPI/SQLite backend and React/TypeScript dashboard to watch fleet state over WebSockets and compare run results. Repeatable parameter sweeps cover robot ratios, fleet size, and charging-station count.</w:t>
       </w:r>
     </w:p>
     <w:p>
@@ -433,7 +433,7 @@
         </w:numPr>
       </w:pPr>
       <w:r>
-        <w:t>Developed the Raspberry Pi 5 telemetry and monitoring stack: MAVLink backend, WebSocket server and browser dashboard for flight state, mission progress, payload status and ArUco-marker visualisation.</w:t>
+        <w:t>Built the Raspberry Pi 5 MAVLink backend, WebSocket server, and browser dashboard to monitor flight state, mission progress, payload status, and ArUco markers.</w:t>
       </w:r>
     </w:p>
     <w:p>
@@ -446,7 +446,7 @@
         </w:numPr>
       </w:pPr>
       <w:r>
-        <w:t>Resolved MAVLink serial contention with a MAVProxy UDP multiplexer, compiled Intel RealSense support for Raspberry Pi from source and tuned telemetry rates to reduce CPU load before full-system integration.</w:t>
+        <w:t>Used MAVProxy to share telemetry over UDP and resolve MAVLink serial conflicts. Compiled Intel RealSense support for Raspberry Pi from source and adjusted telemetry rates to reduce CPU load before integration.</w:t>
       </w:r>
     </w:p>
     <w:p>
@@ -459,23 +459,21 @@
         </w:numPr>
       </w:pPr>
       <w:r>
-        <w:t>Co-developed and executed safe autonomous-flight test procedures covering pre-flight readiness, failsafe monitoring, radio-controller/manual overrides, abort sequences and loss-of-control response; integrated testing recorded a 9 N peak payload impact.</w:t>
+        <w:t>Helped write and carry out autonomous-flight tests with pre-flight checks, failsafe monitoring, manual overrides, and procedures for aborts and loss of control. Integrated testing recorded a peak payload impact force of 9 N.</w:t>
       </w:r>
     </w:p>
     <w:p>
-      <w:r>
-        <w:br w:type="page"/>
-      </w:r>
+      <w:r/>
     </w:p>
     <w:p>
       <w:pPr>
         <w:pStyle w:val="Heading1"/>
+        <w:pageBreakBefore/>
       </w:pPr>
       <w:r>
         <w:rPr>
           <w:rFonts w:ascii="Calibri" w:hAnsi="Calibri"/>
         </w:rPr>
-        <w:lastRenderedPageBreak/>
         <w:t>OPEN SOURCE &amp; INDEPENDENT ENGINEERING</w:t>
       </w:r>
     </w:p>
@@ -513,27 +511,25 @@
         </w:numPr>
       </w:pPr>
       <w:r>
-        <w:t>Contributed mixed-filament colour-mixing and Local-Z dithering with ratdoux and collaborators in OrcaSlicer's C++ codebase. Snapmaker - the 3D-printer manufacturer - merged the co-authored code into its official Snapmaker Orca slicer (</w:t>
+        <w:t xml:space="preserve">Worked with ratdoux and other contributors on colour mixing and local-Z dithering in OrcaSlicer's C++ codebase. Snapmaker merged our code into its official slicer in </w:t>
       </w:r>
       <w:hyperlink r:id="rId13">
         <w:r>
           <w:rPr>
-            <w:color w:val="1F6B68"/>
-            <w:sz w:val="20"/>
+            <w:rStyle w:val="Hyperlink"/>
           </w:rPr>
           <w:t>PR #409</w:t>
         </w:r>
       </w:hyperlink>
       <w:r>
-        <w:t xml:space="preserve">), and upstream OrcaSlicer credits the contribution in </w:t>
+        <w:t xml:space="preserve">. Upstream OrcaSlicer also credits our contribution in </w:t>
       </w:r>
       <w:hyperlink r:id="rId14">
         <w:r>
           <w:rPr>
-            <w:color w:val="1F6B68"/>
-            <w:sz w:val="20"/>
+            <w:rStyle w:val="Hyperlink"/>
           </w:rPr>
-          <w:t>mainline PR #13437</w:t>
+          <w:t>PR #13437</w:t>
         </w:r>
       </w:hyperlink>
       <w:r>
@@ -550,7 +546,7 @@
         </w:numPr>
       </w:pPr>
       <w:r>
-        <w:t>Applied disciplined Git workflows and collaborative engineering practices across feature integration, testing, documentation and maintenance of a complex cross-platform application.</w:t>
+        <w:t>Used Git to collaborate on the changes and helped with integration, testing, documentation, and ongoing maintenance.</w:t>
       </w:r>
     </w:p>
     <w:p>
@@ -564,7 +560,7 @@
           <w:rPr>
             <w:b/>
           </w:rPr>
-          <w:t>Custom android updates</w:t>
+          <w:t>Custom Android updates</w:t>
         </w:r>
         <w:r>
           <w:rPr>
@@ -595,19 +591,18 @@
         </w:numPr>
       </w:pPr>
       <w:r>
-        <w:t xml:space="preserve">Built and maintained an official Android 10 ROM for multiple Note 5 variants, working with device trees, kernel and vendor sources, release builds, updates and user support; exceeded 10,000 downloads on the </w:t>
+        <w:t xml:space="preserve">Built and maintained an official Android 10 ROM for multiple Note 5 variants using device trees, kernel, and vendor sources. Managed releases, updates, and user support. The </w:t>
       </w:r>
       <w:hyperlink r:id="rId16">
         <w:r>
           <w:rPr>
-            <w:color w:val="1F6B68"/>
-            <w:sz w:val="20"/>
+            <w:rStyle w:val="Hyperlink"/>
           </w:rPr>
           <w:t>XDA Developers release page</w:t>
         </w:r>
       </w:hyperlink>
       <w:r>
-        <w:t>.</w:t>
+        <w:t xml:space="preserve"> passed 10,000 downloads.</w:t>
       </w:r>
     </w:p>
     <w:p>
@@ -644,7 +639,7 @@
         </w:numPr>
       </w:pPr>
       <w:r>
-        <w:t>Ported Armbian to several Android phones and evaluated them as low-cost home servers and Raspberry Pi alternatives, using the built-in battery as a UPS and USB breakout hardware for GPIO/UART connectivity.</w:t>
+        <w:t>Ported Armbian to several Android phones and tested them as low-cost home servers and Raspberry Pi alternatives. Used their batteries as backup power and USB breakout hardware for GPIO/UART connections.</w:t>
       </w:r>
     </w:p>
     <w:p>
@@ -720,7 +715,7 @@
         </w:numPr>
       </w:pPr>
       <w:r>
-        <w:t>Analog design: designed and breadboard-tested BJT amplifier circuits; proficient in LTspice simulation and analysis.</w:t>
+        <w:t>Analogue design: designed and breadboard-tested BJT amplifier circuits and used LTspice for simulation and analysis.</w:t>
       </w:r>
     </w:p>
     <w:p>
@@ -733,17 +728,11 @@
         </w:numPr>
       </w:pPr>
       <w:r>
-        <w:t xml:space="preserve">Embedded: </w:t>
+        <w:t>Embedded: built an ESP32 web-based aircraft infotainment prototype.</w:t>
       </w:r>
-      <w:r>
-        <w:t>D</w:t>
-      </w:r>
-      <w:r>
-        <w:t>eveloped an ESP32 web-based aircraft infotainment prototype</w:t>
-      </w:r>
-      <w:r>
-        <w:t>.</w:t>
-      </w:r>
+      <w:r/>
+      <w:r/>
+      <w:r/>
     </w:p>
     <w:p>
       <w:pPr>
@@ -755,7 +744,7 @@
         </w:numPr>
       </w:pPr>
       <w:r>
-        <w:t>Computer Vision: YOLO-based plant-disease identification system.</w:t>
+        <w:t>Computer vision: built a YOLO-based plant-disease identification system.</w:t>
       </w:r>
     </w:p>
     <w:p>
@@ -809,42 +798,14 @@
       <w:r>
         <w:rPr>
           <w:b/>
-          <w:color w:val="173B57"/>
         </w:rPr>
         <w:t xml:space="preserve">Software &amp; systems: </w:t>
       </w:r>
       <w:r>
-        <w:t>Git/GitHub, Linux (</w:t>
-      </w:r>
-      <w:proofErr w:type="spellStart"/>
-      <w:r>
-        <w:t>Arch</w:t>
-      </w:r>
-      <w:r>
-        <w:t>linux</w:t>
-      </w:r>
-      <w:proofErr w:type="spellEnd"/>
-      <w:r>
-        <w:t xml:space="preserve"> as primary desktop OS</w:t>
-      </w:r>
-      <w:r>
-        <w:t xml:space="preserve">), Docker, </w:t>
-      </w:r>
-      <w:proofErr w:type="spellStart"/>
-      <w:r>
-        <w:t>FastAPI</w:t>
-      </w:r>
-      <w:proofErr w:type="spellEnd"/>
-      <w:r>
-        <w:t xml:space="preserve">, React, </w:t>
-      </w:r>
-      <w:proofErr w:type="spellStart"/>
-      <w:r>
-        <w:t>SimPy</w:t>
-      </w:r>
-      <w:proofErr w:type="spellEnd"/>
-      <w:r>
-        <w:t>, SQLite, REST, WebSockets/SSE, testing and documentation</w:t>
+        <w:rPr>
+          <w:b w:val="0"/>
+        </w:rPr>
+        <w:t>Git/GitHub, Linux, Docker, FastAPI, React, SimPy, SQLite, REST, WebSockets/SSE, testing and documentation. Arch Linux is my daily desktop OS.</w:t>
       </w:r>
     </w:p>
     <w:p>

</xml_diff>